<commit_message>
Revert "chore(forms): 서식 240 종 빌드·사이트 갱신"
This reverts commit 9ec8b8cafd33603018aa6a2c825c83fdd06e463f.
</commit_message>
<xml_diff>
--- a/masters/resume-basic/resume-basic.docx
+++ b/masters/resume-basic/resume-basic.docx
@@ -4,7 +4,7 @@
   <w:body>
     <w:p>
       <w:pPr>
-        <w:spacing w:after="26" w:before="0" w:line="312" w:lineRule="auto"/>
+        <w:spacing w:after="37" w:before="0" w:line="312" w:lineRule="auto"/>
         <w:jc w:val="center"/>
       </w:pPr>
       <w:r>
@@ -19,7 +19,7 @@
     </w:p>
     <w:p>
       <w:pPr>
-        <w:spacing w:after="66" w:before="0" w:line="312" w:lineRule="auto"/>
+        <w:spacing w:after="92" w:before="0" w:line="312" w:lineRule="auto"/>
         <w:jc w:val="left"/>
         <w:pBdr>
           <w:bottom w:val="single" w:sz="14" w:space="2" w:color="24384F"/>
@@ -52,7 +52,7 @@
       </w:tblGrid>
       <w:tr>
         <w:trPr>
-          <w:trHeight w:val="308" w:hRule="atLeast"/>
+          <w:trHeight w:val="391" w:hRule="atLeast"/>
         </w:trPr>
         <w:tc>
           <w:tcPr>
@@ -229,10 +229,6 @@
               <w:bottom w:val="single" w:sz="6" w:space="0" w:color="C9D2DD"/>
               <w:right w:val="single" w:sz="6" w:space="0" w:color="C9D2DD"/>
             </w:tcBorders>
-            <w:tcMar>
-              <w:left w:w="0" w:type="dxa"/>
-              <w:right w:w="0" w:type="dxa"/>
-            </w:tcMar>
             <w:vAlign w:val="center"/>
           </w:tcPr>
           <w:p>
@@ -254,7 +250,7 @@
       </w:tr>
       <w:tr>
         <w:trPr>
-          <w:trHeight w:val="308" w:hRule="atLeast"/>
+          <w:trHeight w:val="391" w:hRule="atLeast"/>
         </w:trPr>
         <w:tc>
           <w:tcPr>
@@ -438,7 +434,7 @@
       </w:tr>
       <w:tr>
         <w:trPr>
-          <w:trHeight w:val="308" w:hRule="atLeast"/>
+          <w:trHeight w:val="391" w:hRule="atLeast"/>
         </w:trPr>
         <w:tc>
           <w:tcPr>
@@ -513,7 +509,7 @@
       </w:tr>
       <w:tr>
         <w:trPr>
-          <w:trHeight w:val="308" w:hRule="atLeast"/>
+          <w:trHeight w:val="391" w:hRule="atLeast"/>
         </w:trPr>
         <w:tc>
           <w:tcPr>
@@ -588,7 +584,7 @@
       </w:tr>
       <w:tr>
         <w:trPr>
-          <w:trHeight w:val="308" w:hRule="atLeast"/>
+          <w:trHeight w:val="391" w:hRule="atLeast"/>
         </w:trPr>
         <w:tc>
           <w:tcPr>
@@ -773,7 +769,7 @@
     </w:tbl>
     <w:p>
       <w:pPr>
-        <w:spacing w:after="26" w:before="0" w:line="312" w:lineRule="auto"/>
+        <w:spacing w:after="37" w:before="0" w:line="312" w:lineRule="auto"/>
         <w:jc w:val="left"/>
       </w:pPr>
       <w:r>
@@ -786,7 +782,7 @@
     </w:p>
     <w:p>
       <w:pPr>
-        <w:spacing w:after="26" w:before="53" w:line="312" w:lineRule="auto"/>
+        <w:spacing w:after="37" w:before="74" w:line="312" w:lineRule="auto"/>
         <w:jc w:val="left"/>
         <w:pBdr>
           <w:bottom w:val="single" w:sz="6" w:space="2" w:color="C9D2DD"/>
@@ -828,7 +824,7 @@
       </w:tblGrid>
       <w:tr>
         <w:trPr>
-          <w:trHeight w:val="280" w:hRule="atLeast"/>
+          <w:trHeight w:val="391" w:hRule="atLeast"/>
         </w:trPr>
         <w:tc>
           <w:tcPr>
@@ -978,7 +974,7 @@
       </w:tr>
       <w:tr>
         <w:trPr>
-          <w:trHeight w:val="280" w:hRule="atLeast"/>
+          <w:trHeight w:val="391" w:hRule="atLeast"/>
         </w:trPr>
         <w:tc>
           <w:tcPr>
@@ -994,7 +990,7 @@
           <w:p>
             <w:pPr>
               <w:spacing w:after="0" w:line="312" w:lineRule="auto"/>
-              <w:jc w:val="center"/>
+              <w:jc w:val="left"/>
             </w:pPr>
             <w:r/>
             <w:r>
@@ -1020,7 +1016,7 @@
           <w:p>
             <w:pPr>
               <w:spacing w:after="0" w:line="312" w:lineRule="auto"/>
-              <w:jc w:val="center"/>
+              <w:jc w:val="left"/>
             </w:pPr>
             <w:r/>
             <w:r>
@@ -1046,7 +1042,7 @@
           <w:p>
             <w:pPr>
               <w:spacing w:after="0" w:line="312" w:lineRule="auto"/>
-              <w:jc w:val="center"/>
+              <w:jc w:val="left"/>
             </w:pPr>
             <w:r/>
             <w:r>
@@ -1072,7 +1068,7 @@
           <w:p>
             <w:pPr>
               <w:spacing w:after="0" w:line="312" w:lineRule="auto"/>
-              <w:jc w:val="center"/>
+              <w:jc w:val="left"/>
             </w:pPr>
             <w:r/>
             <w:r>
@@ -1098,7 +1094,7 @@
           <w:p>
             <w:pPr>
               <w:spacing w:after="0" w:line="312" w:lineRule="auto"/>
-              <w:jc w:val="center"/>
+              <w:jc w:val="left"/>
             </w:pPr>
             <w:r/>
             <w:r>
@@ -1113,7 +1109,7 @@
       </w:tr>
       <w:tr>
         <w:trPr>
-          <w:trHeight w:val="280" w:hRule="atLeast"/>
+          <w:trHeight w:val="391" w:hRule="atLeast"/>
         </w:trPr>
         <w:tc>
           <w:tcPr>
@@ -1129,7 +1125,7 @@
           <w:p>
             <w:pPr>
               <w:spacing w:after="0" w:line="312" w:lineRule="auto"/>
-              <w:jc w:val="center"/>
+              <w:jc w:val="left"/>
             </w:pPr>
             <w:r/>
             <w:r>
@@ -1155,7 +1151,7 @@
           <w:p>
             <w:pPr>
               <w:spacing w:after="0" w:line="312" w:lineRule="auto"/>
-              <w:jc w:val="center"/>
+              <w:jc w:val="left"/>
             </w:pPr>
             <w:r/>
             <w:r>
@@ -1181,7 +1177,7 @@
           <w:p>
             <w:pPr>
               <w:spacing w:after="0" w:line="312" w:lineRule="auto"/>
-              <w:jc w:val="center"/>
+              <w:jc w:val="left"/>
             </w:pPr>
             <w:r/>
             <w:r>
@@ -1207,7 +1203,7 @@
           <w:p>
             <w:pPr>
               <w:spacing w:after="0" w:line="312" w:lineRule="auto"/>
-              <w:jc w:val="center"/>
+              <w:jc w:val="left"/>
             </w:pPr>
             <w:r/>
             <w:r>
@@ -1233,7 +1229,7 @@
           <w:p>
             <w:pPr>
               <w:spacing w:after="0" w:line="312" w:lineRule="auto"/>
-              <w:jc w:val="center"/>
+              <w:jc w:val="left"/>
             </w:pPr>
             <w:r/>
             <w:r>
@@ -1248,7 +1244,7 @@
       </w:tr>
       <w:tr>
         <w:trPr>
-          <w:trHeight w:val="280" w:hRule="atLeast"/>
+          <w:trHeight w:val="391" w:hRule="atLeast"/>
         </w:trPr>
         <w:tc>
           <w:tcPr>
@@ -1264,7 +1260,7 @@
           <w:p>
             <w:pPr>
               <w:spacing w:after="0" w:line="312" w:lineRule="auto"/>
-              <w:jc w:val="center"/>
+              <w:jc w:val="left"/>
             </w:pPr>
             <w:r/>
             <w:r>
@@ -1290,7 +1286,7 @@
           <w:p>
             <w:pPr>
               <w:spacing w:after="0" w:line="312" w:lineRule="auto"/>
-              <w:jc w:val="center"/>
+              <w:jc w:val="left"/>
             </w:pPr>
             <w:r/>
             <w:r>
@@ -1316,7 +1312,7 @@
           <w:p>
             <w:pPr>
               <w:spacing w:after="0" w:line="312" w:lineRule="auto"/>
-              <w:jc w:val="center"/>
+              <w:jc w:val="left"/>
             </w:pPr>
             <w:r/>
             <w:r>
@@ -1342,7 +1338,7 @@
           <w:p>
             <w:pPr>
               <w:spacing w:after="0" w:line="312" w:lineRule="auto"/>
-              <w:jc w:val="center"/>
+              <w:jc w:val="left"/>
             </w:pPr>
             <w:r/>
             <w:r>
@@ -1368,7 +1364,7 @@
           <w:p>
             <w:pPr>
               <w:spacing w:after="0" w:line="312" w:lineRule="auto"/>
-              <w:jc w:val="center"/>
+              <w:jc w:val="left"/>
             </w:pPr>
             <w:r/>
             <w:r>
@@ -1384,7 +1380,7 @@
     </w:tbl>
     <w:p>
       <w:pPr>
-        <w:spacing w:after="26" w:before="0" w:line="312" w:lineRule="auto"/>
+        <w:spacing w:after="37" w:before="0" w:line="312" w:lineRule="auto"/>
         <w:jc w:val="left"/>
       </w:pPr>
       <w:r>
@@ -1397,7 +1393,7 @@
     </w:p>
     <w:p>
       <w:pPr>
-        <w:spacing w:after="26" w:before="53" w:line="312" w:lineRule="auto"/>
+        <w:spacing w:after="37" w:before="74" w:line="312" w:lineRule="auto"/>
         <w:jc w:val="left"/>
         <w:pBdr>
           <w:bottom w:val="single" w:sz="6" w:space="2" w:color="C9D2DD"/>
@@ -1439,7 +1435,7 @@
       </w:tblGrid>
       <w:tr>
         <w:trPr>
-          <w:trHeight w:val="280" w:hRule="atLeast"/>
+          <w:trHeight w:val="391" w:hRule="atLeast"/>
         </w:trPr>
         <w:tc>
           <w:tcPr>
@@ -1589,7 +1585,7 @@
       </w:tr>
       <w:tr>
         <w:trPr>
-          <w:trHeight w:val="280" w:hRule="atLeast"/>
+          <w:trHeight w:val="391" w:hRule="atLeast"/>
         </w:trPr>
         <w:tc>
           <w:tcPr>
@@ -1605,7 +1601,7 @@
           <w:p>
             <w:pPr>
               <w:spacing w:after="0" w:line="312" w:lineRule="auto"/>
-              <w:jc w:val="center"/>
+              <w:jc w:val="left"/>
             </w:pPr>
             <w:r/>
             <w:r>
@@ -1631,7 +1627,7 @@
           <w:p>
             <w:pPr>
               <w:spacing w:after="0" w:line="312" w:lineRule="auto"/>
-              <w:jc w:val="center"/>
+              <w:jc w:val="left"/>
             </w:pPr>
             <w:r/>
             <w:r>
@@ -1657,7 +1653,7 @@
           <w:p>
             <w:pPr>
               <w:spacing w:after="0" w:line="312" w:lineRule="auto"/>
-              <w:jc w:val="center"/>
+              <w:jc w:val="left"/>
             </w:pPr>
             <w:r/>
             <w:r>
@@ -1683,7 +1679,7 @@
           <w:p>
             <w:pPr>
               <w:spacing w:after="0" w:line="312" w:lineRule="auto"/>
-              <w:jc w:val="center"/>
+              <w:jc w:val="left"/>
             </w:pPr>
             <w:r/>
             <w:r>
@@ -1709,7 +1705,7 @@
           <w:p>
             <w:pPr>
               <w:spacing w:after="0" w:line="312" w:lineRule="auto"/>
-              <w:jc w:val="center"/>
+              <w:jc w:val="left"/>
             </w:pPr>
             <w:r/>
             <w:r>
@@ -1724,7 +1720,7 @@
       </w:tr>
       <w:tr>
         <w:trPr>
-          <w:trHeight w:val="280" w:hRule="atLeast"/>
+          <w:trHeight w:val="391" w:hRule="atLeast"/>
         </w:trPr>
         <w:tc>
           <w:tcPr>
@@ -1740,7 +1736,7 @@
           <w:p>
             <w:pPr>
               <w:spacing w:after="0" w:line="312" w:lineRule="auto"/>
-              <w:jc w:val="center"/>
+              <w:jc w:val="left"/>
             </w:pPr>
             <w:r/>
             <w:r>
@@ -1766,7 +1762,7 @@
           <w:p>
             <w:pPr>
               <w:spacing w:after="0" w:line="312" w:lineRule="auto"/>
-              <w:jc w:val="center"/>
+              <w:jc w:val="left"/>
             </w:pPr>
             <w:r/>
             <w:r>
@@ -1792,7 +1788,7 @@
           <w:p>
             <w:pPr>
               <w:spacing w:after="0" w:line="312" w:lineRule="auto"/>
-              <w:jc w:val="center"/>
+              <w:jc w:val="left"/>
             </w:pPr>
             <w:r/>
             <w:r>
@@ -1818,7 +1814,7 @@
           <w:p>
             <w:pPr>
               <w:spacing w:after="0" w:line="312" w:lineRule="auto"/>
-              <w:jc w:val="center"/>
+              <w:jc w:val="left"/>
             </w:pPr>
             <w:r/>
             <w:r>
@@ -1844,7 +1840,7 @@
           <w:p>
             <w:pPr>
               <w:spacing w:after="0" w:line="312" w:lineRule="auto"/>
-              <w:jc w:val="center"/>
+              <w:jc w:val="left"/>
             </w:pPr>
             <w:r/>
             <w:r>
@@ -1859,7 +1855,7 @@
       </w:tr>
       <w:tr>
         <w:trPr>
-          <w:trHeight w:val="280" w:hRule="atLeast"/>
+          <w:trHeight w:val="391" w:hRule="atLeast"/>
         </w:trPr>
         <w:tc>
           <w:tcPr>
@@ -1875,7 +1871,7 @@
           <w:p>
             <w:pPr>
               <w:spacing w:after="0" w:line="312" w:lineRule="auto"/>
-              <w:jc w:val="center"/>
+              <w:jc w:val="left"/>
             </w:pPr>
             <w:r/>
             <w:r>
@@ -1901,7 +1897,7 @@
           <w:p>
             <w:pPr>
               <w:spacing w:after="0" w:line="312" w:lineRule="auto"/>
-              <w:jc w:val="center"/>
+              <w:jc w:val="left"/>
             </w:pPr>
             <w:r/>
             <w:r>
@@ -1927,7 +1923,7 @@
           <w:p>
             <w:pPr>
               <w:spacing w:after="0" w:line="312" w:lineRule="auto"/>
-              <w:jc w:val="center"/>
+              <w:jc w:val="left"/>
             </w:pPr>
             <w:r/>
             <w:r>
@@ -1953,7 +1949,7 @@
           <w:p>
             <w:pPr>
               <w:spacing w:after="0" w:line="312" w:lineRule="auto"/>
-              <w:jc w:val="center"/>
+              <w:jc w:val="left"/>
             </w:pPr>
             <w:r/>
             <w:r>
@@ -1979,7 +1975,7 @@
           <w:p>
             <w:pPr>
               <w:spacing w:after="0" w:line="312" w:lineRule="auto"/>
-              <w:jc w:val="center"/>
+              <w:jc w:val="left"/>
             </w:pPr>
             <w:r/>
             <w:r>
@@ -1995,7 +1991,7 @@
     </w:tbl>
     <w:p>
       <w:pPr>
-        <w:spacing w:after="26" w:before="0" w:line="312" w:lineRule="auto"/>
+        <w:spacing w:after="37" w:before="0" w:line="312" w:lineRule="auto"/>
         <w:jc w:val="left"/>
       </w:pPr>
       <w:r>
@@ -2008,7 +2004,7 @@
     </w:p>
     <w:p>
       <w:pPr>
-        <w:spacing w:after="26" w:before="53" w:line="312" w:lineRule="auto"/>
+        <w:spacing w:after="37" w:before="74" w:line="312" w:lineRule="auto"/>
         <w:jc w:val="left"/>
         <w:pBdr>
           <w:bottom w:val="single" w:sz="6" w:space="2" w:color="C9D2DD"/>
@@ -2049,7 +2045,7 @@
       </w:tblGrid>
       <w:tr>
         <w:trPr>
-          <w:trHeight w:val="280" w:hRule="atLeast"/>
+          <w:trHeight w:val="391" w:hRule="atLeast"/>
         </w:trPr>
         <w:tc>
           <w:tcPr>
@@ -2170,7 +2166,7 @@
       </w:tr>
       <w:tr>
         <w:trPr>
-          <w:trHeight w:val="280" w:hRule="atLeast"/>
+          <w:trHeight w:val="391" w:hRule="atLeast"/>
         </w:trPr>
         <w:tc>
           <w:tcPr>
@@ -2186,7 +2182,7 @@
           <w:p>
             <w:pPr>
               <w:spacing w:after="0" w:line="312" w:lineRule="auto"/>
-              <w:jc w:val="center"/>
+              <w:jc w:val="left"/>
             </w:pPr>
             <w:r/>
             <w:r>
@@ -2212,7 +2208,7 @@
           <w:p>
             <w:pPr>
               <w:spacing w:after="0" w:line="312" w:lineRule="auto"/>
-              <w:jc w:val="center"/>
+              <w:jc w:val="left"/>
             </w:pPr>
             <w:r/>
             <w:r>
@@ -2238,7 +2234,7 @@
           <w:p>
             <w:pPr>
               <w:spacing w:after="0" w:line="312" w:lineRule="auto"/>
-              <w:jc w:val="center"/>
+              <w:jc w:val="left"/>
             </w:pPr>
             <w:r/>
             <w:r>
@@ -2264,7 +2260,7 @@
           <w:p>
             <w:pPr>
               <w:spacing w:after="0" w:line="312" w:lineRule="auto"/>
-              <w:jc w:val="center"/>
+              <w:jc w:val="left"/>
             </w:pPr>
             <w:r/>
             <w:r>
@@ -2279,7 +2275,7 @@
       </w:tr>
       <w:tr>
         <w:trPr>
-          <w:trHeight w:val="280" w:hRule="atLeast"/>
+          <w:trHeight w:val="391" w:hRule="atLeast"/>
         </w:trPr>
         <w:tc>
           <w:tcPr>
@@ -2295,7 +2291,7 @@
           <w:p>
             <w:pPr>
               <w:spacing w:after="0" w:line="312" w:lineRule="auto"/>
-              <w:jc w:val="center"/>
+              <w:jc w:val="left"/>
             </w:pPr>
             <w:r/>
             <w:r>
@@ -2321,7 +2317,7 @@
           <w:p>
             <w:pPr>
               <w:spacing w:after="0" w:line="312" w:lineRule="auto"/>
-              <w:jc w:val="center"/>
+              <w:jc w:val="left"/>
             </w:pPr>
             <w:r/>
             <w:r>
@@ -2347,7 +2343,7 @@
           <w:p>
             <w:pPr>
               <w:spacing w:after="0" w:line="312" w:lineRule="auto"/>
-              <w:jc w:val="center"/>
+              <w:jc w:val="left"/>
             </w:pPr>
             <w:r/>
             <w:r>
@@ -2373,7 +2369,7 @@
           <w:p>
             <w:pPr>
               <w:spacing w:after="0" w:line="312" w:lineRule="auto"/>
-              <w:jc w:val="center"/>
+              <w:jc w:val="left"/>
             </w:pPr>
             <w:r/>
             <w:r>
@@ -2389,7 +2385,7 @@
     </w:tbl>
     <w:p>
       <w:pPr>
-        <w:spacing w:after="26" w:before="0" w:line="312" w:lineRule="auto"/>
+        <w:spacing w:after="37" w:before="0" w:line="312" w:lineRule="auto"/>
         <w:jc w:val="left"/>
       </w:pPr>
       <w:r>
@@ -2402,7 +2398,7 @@
     </w:p>
     <w:p>
       <w:pPr>
-        <w:spacing w:after="26" w:before="53" w:line="312" w:lineRule="auto"/>
+        <w:spacing w:after="37" w:before="74" w:line="312" w:lineRule="auto"/>
         <w:jc w:val="left"/>
         <w:pBdr>
           <w:bottom w:val="single" w:sz="6" w:space="2" w:color="C9D2DD"/>
@@ -2445,7 +2441,7 @@
       </w:tblGrid>
       <w:tr>
         <w:trPr>
-          <w:trHeight w:val="280" w:hRule="atLeast"/>
+          <w:trHeight w:val="391" w:hRule="atLeast"/>
         </w:trPr>
         <w:tc>
           <w:tcPr>
@@ -2615,7 +2611,7 @@
       </w:tr>
       <w:tr>
         <w:trPr>
-          <w:trHeight w:val="280" w:hRule="atLeast"/>
+          <w:trHeight w:val="391" w:hRule="atLeast"/>
         </w:trPr>
         <w:tc>
           <w:tcPr>
@@ -2786,7 +2782,7 @@
     </w:tbl>
     <w:p>
       <w:pPr>
-        <w:spacing w:after="26" w:before="0" w:line="312" w:lineRule="auto"/>
+        <w:spacing w:after="37" w:before="0" w:line="312" w:lineRule="auto"/>
         <w:jc w:val="left"/>
       </w:pPr>
       <w:r>
@@ -2799,7 +2795,7 @@
     </w:p>
     <w:p>
       <w:pPr>
-        <w:spacing w:after="26" w:before="0" w:line="312" w:lineRule="auto"/>
+        <w:spacing w:after="37" w:before="0" w:line="312" w:lineRule="auto"/>
         <w:jc w:val="center"/>
       </w:pPr>
       <w:r>
@@ -2813,7 +2809,7 @@
     </w:p>
     <w:p>
       <w:pPr>
-        <w:spacing w:after="53" w:before="53" w:line="312" w:lineRule="auto"/>
+        <w:spacing w:after="74" w:before="74" w:line="312" w:lineRule="auto"/>
         <w:jc w:val="center"/>
       </w:pPr>
       <w:r>
@@ -2827,7 +2823,7 @@
     </w:p>
     <w:p>
       <w:pPr>
-        <w:spacing w:after="53" w:before="0" w:line="312" w:lineRule="auto"/>
+        <w:spacing w:after="74" w:before="0" w:line="312" w:lineRule="auto"/>
         <w:jc w:val="right"/>
       </w:pPr>
       <w:r>
@@ -2841,7 +2837,7 @@
     </w:p>
     <w:p>
       <w:pPr>
-        <w:spacing w:after="0" w:before="40" w:line="312" w:lineRule="auto"/>
+        <w:spacing w:after="0" w:before="55" w:line="312" w:lineRule="auto"/>
         <w:jc w:val="left"/>
       </w:pPr>
       <w:r>

</xml_diff>